<commit_message>
Ficha: muestra el valor que se debe a Protect Motos (columna O) en lugar de 'Al día'; documento actualizado
Co-Authored-By: Claude Sonnet 5.5 <noreply@anthropic.com>
Claude-Session: https://claude.ai/code/session_01BNPGZGSYuayLkFXqQEsnRu
</commit_message>
<xml_diff>
--- a/docs/Prompt_Claude_Code_Conciliacion_Protect_Motos.docx
+++ b/docs/Prompt_Claude_Code_Conciliacion_Protect_Motos.docx
@@ -43,7 +43,7 @@
           <w:sz w:val="21"/>
           <w:szCs w:val="21"/>
         </w:rPr>
-        <w:t xml:space="preserve">Versión de referencia: HTML v2026-10-16.10 · conector v11 · repositorio negociemosgroupsas-blip/automatizacion_protect_motos · rama claude/optimistic-davinci-jznrlc.</w:t>
+        <w:t xml:space="preserve">Versión de referencia: HTML v2026-10-23.1 · conector v11 · repositorio negociemosgroupsas-blip/automatizacion_protect_motos · rama claude/optimistic-davinci-jznrlc.</w:t>
       </w:r>
     </w:p>
     <w:p>
@@ -927,6 +927,101 @@
                 <w:sz w:val="19"/>
                 <w:szCs w:val="19"/>
               </w:rPr>
+              <w:t xml:space="preserve">O (15)</w:t>
+            </w:r>
+          </w:p>
+        </w:tc>
+        <w:tc>
+          <w:tcPr>
+            <w:tcW w:type="dxa" w:w="2200"/>
+            <w:tcBorders>
+              <w:top w:val="single" w:color="C9CED8" w:sz="4"/>
+              <w:left w:val="single" w:color="C9CED8" w:sz="4"/>
+              <w:bottom w:val="single" w:color="C9CED8" w:sz="4"/>
+              <w:right w:val="single" w:color="C9CED8" w:sz="4"/>
+            </w:tcBorders>
+            <w:tcMar>
+              <w:top w:type="dxa" w:w="60"/>
+              <w:left w:type="dxa" w:w="100"/>
+              <w:bottom w:type="dxa" w:w="60"/>
+              <w:right w:type="dxa" w:w="100"/>
+            </w:tcMar>
+          </w:tcPr>
+          <w:p>
+            <w:r>
+              <w:rPr>
+                <w:rFonts w:ascii="Arial" w:cs="Arial" w:eastAsia="Arial" w:hAnsi="Arial"/>
+                <w:b w:val="false"/>
+                <w:bCs w:val="false"/>
+                <w:color w:val="1F2430"/>
+                <w:sz w:val="19"/>
+                <w:szCs w:val="19"/>
+              </w:rPr>
+              <w:t xml:space="preserve">Valor que se debe a Protect Motos</w:t>
+            </w:r>
+          </w:p>
+        </w:tc>
+        <w:tc>
+          <w:tcPr>
+            <w:tcW w:type="dxa" w:w="5660"/>
+            <w:tcBorders>
+              <w:top w:val="single" w:color="C9CED8" w:sz="4"/>
+              <w:left w:val="single" w:color="C9CED8" w:sz="4"/>
+              <w:bottom w:val="single" w:color="C9CED8" w:sz="4"/>
+              <w:right w:val="single" w:color="C9CED8" w:sz="4"/>
+            </w:tcBorders>
+            <w:tcMar>
+              <w:top w:type="dxa" w:w="60"/>
+              <w:left w:type="dxa" w:w="100"/>
+              <w:bottom w:type="dxa" w:w="60"/>
+              <w:right w:type="dxa" w:w="100"/>
+            </w:tcMar>
+          </w:tcPr>
+          <w:p>
+            <w:r>
+              <w:rPr>
+                <w:rFonts w:ascii="Arial" w:cs="Arial" w:eastAsia="Arial" w:hAnsi="Arial"/>
+                <w:b w:val="false"/>
+                <w:bCs w:val="false"/>
+                <w:color w:val="1F2430"/>
+                <w:sz w:val="19"/>
+                <w:szCs w:val="19"/>
+              </w:rPr>
+              <w:t xml:space="preserve">SOLO se muestra en la ficha (tarjeta «Valor que se debe a Protect Motos») y en la descarga CSV. NUNCA interviene en la conciliación ni en las comparaciones.</w:t>
+            </w:r>
+          </w:p>
+        </w:tc>
+      </w:tr>
+      <w:tr>
+        <w:trPr>
+          <w:tblHeader w:val="off"/>
+        </w:trPr>
+        <w:tc>
+          <w:tcPr>
+            <w:tcW w:type="dxa" w:w="1500"/>
+            <w:tcBorders>
+              <w:top w:val="single" w:color="C9CED8" w:sz="4"/>
+              <w:left w:val="single" w:color="C9CED8" w:sz="4"/>
+              <w:bottom w:val="single" w:color="C9CED8" w:sz="4"/>
+              <w:right w:val="single" w:color="C9CED8" w:sz="4"/>
+            </w:tcBorders>
+            <w:tcMar>
+              <w:top w:type="dxa" w:w="60"/>
+              <w:left w:type="dxa" w:w="100"/>
+              <w:bottom w:type="dxa" w:w="60"/>
+              <w:right w:type="dxa" w:w="100"/>
+            </w:tcMar>
+          </w:tcPr>
+          <w:p>
+            <w:r>
+              <w:rPr>
+                <w:rFonts w:ascii="Arial" w:cs="Arial" w:eastAsia="Arial" w:hAnsi="Arial"/>
+                <w:b w:val="false"/>
+                <w:bCs w:val="false"/>
+                <w:color w:val="1F2430"/>
+                <w:sz w:val="19"/>
+                <w:szCs w:val="19"/>
+              </w:rPr>
               <w:t xml:space="preserve">P (16)</w:t>
             </w:r>
           </w:p>
@@ -987,7 +1082,7 @@
                 <w:sz w:val="19"/>
                 <w:szCs w:val="19"/>
               </w:rPr>
-              <w:t xml:space="preserve">Valor de referencia para comparar. NUNCA usar la columna O. Puede venir mal escrito.</w:t>
+              <w:t xml:space="preserve">Valor de referencia para comparar con Consolidado. Puede venir mal escrito.</w:t>
             </w:r>
           </w:p>
         </w:tc>
@@ -3586,7 +3681,7 @@
           <w:sz w:val="21"/>
           <w:szCs w:val="21"/>
         </w:rPr>
-        <w:t xml:space="preserve">Ficha de cliente rediseñada: cabecera con iniciales y etiqueta de estado, datos del cliente, tarjetas de valores (Dugo, Consolidado, Diferencia), avisos de color, detalle del sistema plegable, paneles plegables de asignación, caja «Nota» y «Tu decisión» con botones: Todo bien (Revisado), Pendiente por consolidar (Falta), Marcar como ya consolidado, Dinero entró directo a Protect, Guardar solo la nota, Quitar ajuste/nota.</w:t>
+        <w:t xml:space="preserve">Ficha de cliente rediseñada: cabecera con iniciales y etiqueta de estado, datos del cliente, tarjetas de valores (valor pagado a Dugo Motos, valor que pagó en Consolidado y valor que se debe a Protect Motos de la columna O, con la diferencia en una línea pequeña), avisos de color, detalle del sistema plegable, paneles plegables de asignación, caja «Nota» y «Tu decisión» con botones: Todo bien (Revisado), Pendiente por consolidar (Falta), Marcar como ya consolidado, Dinero entró directo a Protect, Guardar solo la nota, Quitar ajuste/nota.</w:t>
       </w:r>
     </w:p>
     <w:p>

</xml_diff>